<commit_message>
Programming Exercise 4 TDD
</commit_message>
<xml_diff>
--- a/AngelicaMunoz_ProgrammingExercise_4_TDD.docx
+++ b/AngelicaMunoz_ProgrammingExercise_4_TDD.docx
@@ -358,12 +358,15 @@
       </w:r>
     </w:p>
     <w:p>
-      <w:r>
-        <w:rPr>
-          <w:b/>
-        </w:rPr>
-        <w:t>COP 2373 Repository Link</w:t>
-      </w:r>
+      <w:hyperlink r:id="rId6" w:history="1">
+        <w:r>
+          <w:rPr>
+            <w:rStyle w:val="Hyperlink"/>
+            <w:b/>
+          </w:rPr>
+          <w:t>COP 2373 Repository Link</w:t>
+        </w:r>
+      </w:hyperlink>
     </w:p>
     <w:p>
       <w:r>
@@ -406,6 +409,9 @@
     </w:p>
     <w:p>
       <w:r>
+        <w:rPr>
+          <w:noProof/>
+        </w:rPr>
         <w:drawing>
           <wp:inline distT="0" distB="0" distL="0" distR="0" wp14:anchorId="74D6177A" wp14:editId="408152E7">
             <wp:extent cx="5943600" cy="2233295"/>
@@ -422,7 +428,7 @@
                     <pic:cNvPicPr/>
                   </pic:nvPicPr>
                   <pic:blipFill>
-                    <a:blip r:embed="rId6"/>
+                    <a:blip r:embed="rId7"/>
                     <a:stretch>
                       <a:fillRect/>
                     </a:stretch>
@@ -12037,6 +12043,29 @@
       </w:tcPr>
     </w:tblStylePr>
   </w:style>
+  <w:style w:type="character" w:styleId="Hyperlink">
+    <w:name w:val="Hyperlink"/>
+    <w:basedOn w:val="DefaultParagraphFont"/>
+    <w:uiPriority w:val="99"/>
+    <w:unhideWhenUsed/>
+    <w:rsid w:val="00F04976"/>
+    <w:rPr>
+      <w:color w:val="0000FF" w:themeColor="hyperlink"/>
+      <w:u w:val="single"/>
+    </w:rPr>
+  </w:style>
+  <w:style w:type="character" w:styleId="UnresolvedMention">
+    <w:name w:val="Unresolved Mention"/>
+    <w:basedOn w:val="DefaultParagraphFont"/>
+    <w:uiPriority w:val="99"/>
+    <w:semiHidden/>
+    <w:unhideWhenUsed/>
+    <w:rsid w:val="00F04976"/>
+    <w:rPr>
+      <w:color w:val="605E5C"/>
+      <w:shd w:val="clear" w:color="auto" w:fill="E1DFDD"/>
+    </w:rPr>
+  </w:style>
 </w:styles>
 </file>
 

</xml_diff>